<commit_message>
Plantilla de contrato: recoger la version editada en el servidor
La plantilla de contrato de adhesion se habia editado directamente en el
servidor y solo existia alli. Se sube tal cual esta en produccion para que deje
de contar como cambio local: mientras lo fuera, el boton de actualizar quedaba
bloqueado a proposito para no pisar ese trabajo.
</commit_message>
<xml_diff>
--- a/assets/docs/CONTRATO.docx
+++ b/assets/docs/CONTRATO.docx
@@ -1156,6 +1156,36 @@
       </w:pPr>
       <w:r>
         <w:rPr>
+          <w:b/>
+          <w:bCs/>
+          <w:sz w:val="16"/>
+          <w:szCs w:val="16"/>
+        </w:rPr>
+        <w:t xml:space="preserve">Valor Agregado: </w:t>
+      </w:r>
+      <w:r>
+        <w:rPr>
+          <w:b/>
+          <w:bCs/>
+          <w:color w:val="EE0000"/>
+          <w:sz w:val="16"/>
+          <w:szCs w:val="16"/>
+          <w:highlight w:val="yellow"/>
+        </w:rPr>
+        <w:t>X</w:t>
+      </w:r>
+      <w:r>
+        <w:rPr>
+          <w:b/>
+          <w:bCs/>
+          <w:color w:val="EE0000"/>
+          <w:sz w:val="16"/>
+          <w:szCs w:val="16"/>
+        </w:rPr>
+        <w:t xml:space="preserve">  ; </w:t>
+      </w:r>
+      <w:r>
+        <w:rPr>
           <w:sz w:val="16"/>
           <w:szCs w:val="16"/>
         </w:rPr>
@@ -1168,16 +1198,13 @@
         </w:rPr>
         <w:t>:</w:t>
       </w:r>
-    </w:p>
-    <w:p>
-      <w:pPr>
-        <w:contextualSpacing/>
-        <w:jc w:val="both"/>
-        <w:rPr>
-          <w:sz w:val="16"/>
-          <w:szCs w:val="16"/>
-        </w:rPr>
-      </w:pPr>
+      <w:r>
+        <w:rPr>
+          <w:sz w:val="16"/>
+          <w:szCs w:val="16"/>
+        </w:rPr>
+        <w:t xml:space="preserve">; </w:t>
+      </w:r>
       <w:r>
         <w:rPr>
           <w:sz w:val="16"/>
@@ -1192,16 +1219,13 @@
         </w:rPr>
         <w:t>:</w:t>
       </w:r>
-    </w:p>
-    <w:p>
-      <w:pPr>
-        <w:contextualSpacing/>
-        <w:jc w:val="both"/>
-        <w:rPr>
-          <w:sz w:val="16"/>
-          <w:szCs w:val="16"/>
-        </w:rPr>
-      </w:pPr>
+      <w:r>
+        <w:rPr>
+          <w:sz w:val="16"/>
+          <w:szCs w:val="16"/>
+        </w:rPr>
+        <w:t xml:space="preserve">; </w:t>
+      </w:r>
       <w:r>
         <w:rPr>
           <w:sz w:val="16"/>
@@ -1216,16 +1240,13 @@
         </w:rPr>
         <w:t>:</w:t>
       </w:r>
-    </w:p>
-    <w:p>
-      <w:pPr>
-        <w:contextualSpacing/>
-        <w:jc w:val="both"/>
-        <w:rPr>
-          <w:sz w:val="16"/>
-          <w:szCs w:val="16"/>
-        </w:rPr>
-      </w:pPr>
+      <w:r>
+        <w:rPr>
+          <w:sz w:val="16"/>
+          <w:szCs w:val="16"/>
+        </w:rPr>
+        <w:t xml:space="preserve">; </w:t>
+      </w:r>
       <w:r>
         <w:rPr>
           <w:sz w:val="16"/>
@@ -1240,51 +1261,13 @@
         </w:rPr>
         <w:t>:</w:t>
       </w:r>
-    </w:p>
-    <w:p>
-      <w:pPr>
-        <w:contextualSpacing/>
-        <w:jc w:val="both"/>
-        <w:rPr>
-          <w:sz w:val="16"/>
-          <w:szCs w:val="16"/>
-        </w:rPr>
-      </w:pPr>
-      <w:r>
-        <w:rPr>
-          <w:sz w:val="16"/>
-          <w:szCs w:val="16"/>
-        </w:rPr>
-        <w:t>Valor Agregado</w:t>
-      </w:r>
-      <w:r>
-        <w:rPr>
-          <w:sz w:val="16"/>
-          <w:szCs w:val="16"/>
-        </w:rPr>
-        <w:t xml:space="preserve">: </w:t>
-      </w:r>
-      <w:r>
-        <w:rPr>
-          <w:b/>
-          <w:bCs/>
-          <w:color w:val="EE0000"/>
-          <w:sz w:val="16"/>
-          <w:szCs w:val="16"/>
-          <w:highlight w:val="yellow"/>
-        </w:rPr>
-        <w:t>X</w:t>
-      </w:r>
-    </w:p>
-    <w:p>
-      <w:pPr>
-        <w:contextualSpacing/>
-        <w:jc w:val="both"/>
-        <w:rPr>
-          <w:sz w:val="16"/>
-          <w:szCs w:val="16"/>
-        </w:rPr>
-      </w:pPr>
+      <w:r>
+        <w:rPr>
+          <w:sz w:val="16"/>
+          <w:szCs w:val="16"/>
+        </w:rPr>
+        <w:t xml:space="preserve">; </w:t>
+      </w:r>
       <w:r>
         <w:rPr>
           <w:sz w:val="16"/>
@@ -1299,16 +1282,13 @@
         </w:rPr>
         <w:t>:</w:t>
       </w:r>
-    </w:p>
-    <w:p>
-      <w:pPr>
-        <w:contextualSpacing/>
-        <w:jc w:val="both"/>
-        <w:rPr>
-          <w:sz w:val="16"/>
-          <w:szCs w:val="16"/>
-        </w:rPr>
-      </w:pPr>
+      <w:r>
+        <w:rPr>
+          <w:sz w:val="16"/>
+          <w:szCs w:val="16"/>
+        </w:rPr>
+        <w:t xml:space="preserve">; </w:t>
+      </w:r>
       <w:r>
         <w:rPr>
           <w:sz w:val="16"/>
@@ -1323,16 +1303,13 @@
         </w:rPr>
         <w:t>:</w:t>
       </w:r>
-    </w:p>
-    <w:p>
-      <w:pPr>
-        <w:contextualSpacing/>
-        <w:jc w:val="both"/>
-        <w:rPr>
-          <w:sz w:val="16"/>
-          <w:szCs w:val="16"/>
-        </w:rPr>
-      </w:pPr>
+      <w:r>
+        <w:rPr>
+          <w:sz w:val="16"/>
+          <w:szCs w:val="16"/>
+        </w:rPr>
+        <w:t xml:space="preserve">; </w:t>
+      </w:r>
       <w:r>
         <w:rPr>
           <w:sz w:val="16"/>
@@ -1347,16 +1324,13 @@
         </w:rPr>
         <w:t>:</w:t>
       </w:r>
-    </w:p>
-    <w:p>
-      <w:pPr>
-        <w:contextualSpacing/>
-        <w:jc w:val="both"/>
-        <w:rPr>
-          <w:sz w:val="16"/>
-          <w:szCs w:val="16"/>
-        </w:rPr>
-      </w:pPr>
+      <w:r>
+        <w:rPr>
+          <w:sz w:val="16"/>
+          <w:szCs w:val="16"/>
+        </w:rPr>
+        <w:t xml:space="preserve">; </w:t>
+      </w:r>
       <w:r>
         <w:rPr>
           <w:sz w:val="16"/>
@@ -1370,6 +1344,13 @@
           <w:szCs w:val="16"/>
         </w:rPr>
         <w:t>:</w:t>
+      </w:r>
+      <w:r>
+        <w:rPr>
+          <w:sz w:val="16"/>
+          <w:szCs w:val="16"/>
+        </w:rPr>
+        <w:t>.</w:t>
       </w:r>
     </w:p>
     <w:p>
@@ -2292,7 +2273,6 @@
           <w:sz w:val="16"/>
           <w:szCs w:val="16"/>
         </w:rPr>
-        <w:lastRenderedPageBreak/>
         <w:t xml:space="preserve">Pago directo en cajas del prestador del servicio   </w:t>
       </w:r>
       <w:r>
@@ -2458,6 +2438,7 @@
           <w:sz w:val="16"/>
           <w:szCs w:val="16"/>
         </w:rPr>
+        <w:lastRenderedPageBreak/>
         <w:t>CLAUSULA OCTAVA</w:t>
       </w:r>
       <w:r>
@@ -2821,7 +2802,14 @@
           <w:sz w:val="16"/>
           <w:szCs w:val="16"/>
         </w:rPr>
-        <w:t xml:space="preserve">Email:                             </w:t>
+        <w:t>Email:</w:t>
+      </w:r>
+      <w:r>
+        <w:rPr>
+          <w:sz w:val="16"/>
+          <w:szCs w:val="16"/>
+        </w:rPr>
+        <w:t xml:space="preserve"> </w:t>
       </w:r>
       <w:r>
         <w:rPr>
@@ -2834,16 +2822,16 @@
         </w:rPr>
         <w:t>pablobrav_1@hotmail.com</w:t>
       </w:r>
-    </w:p>
-    <w:p>
-      <w:pPr>
-        <w:contextualSpacing/>
-        <w:jc w:val="both"/>
-        <w:rPr>
-          <w:sz w:val="16"/>
-          <w:szCs w:val="16"/>
-        </w:rPr>
-      </w:pPr>
+      <w:r>
+        <w:rPr>
+          <w:b/>
+          <w:bCs/>
+          <w:color w:val="EE0000"/>
+          <w:sz w:val="16"/>
+          <w:szCs w:val="16"/>
+        </w:rPr>
+        <w:t xml:space="preserve"> </w:t>
+      </w:r>
       <w:r>
         <w:rPr>
           <w:sz w:val="16"/>
@@ -2856,7 +2844,7 @@
           <w:sz w:val="16"/>
           <w:szCs w:val="16"/>
         </w:rPr>
-        <w:t xml:space="preserve"> web:                  </w:t>
+        <w:t xml:space="preserve"> web: </w:t>
       </w:r>
       <w:r>
         <w:rPr>
@@ -2869,16 +2857,16 @@
         </w:rPr>
         <w:t>https://www.gobravcorp.com</w:t>
       </w:r>
-    </w:p>
-    <w:p>
-      <w:pPr>
-        <w:contextualSpacing/>
-        <w:jc w:val="both"/>
-        <w:rPr>
-          <w:sz w:val="16"/>
-          <w:szCs w:val="16"/>
-        </w:rPr>
-      </w:pPr>
+      <w:r>
+        <w:rPr>
+          <w:b/>
+          <w:bCs/>
+          <w:color w:val="EE0000"/>
+          <w:sz w:val="16"/>
+          <w:szCs w:val="16"/>
+        </w:rPr>
+        <w:t xml:space="preserve"> </w:t>
+      </w:r>
       <w:r>
         <w:rPr>
           <w:sz w:val="16"/>
@@ -2891,7 +2879,7 @@
           <w:sz w:val="16"/>
           <w:szCs w:val="16"/>
         </w:rPr>
-        <w:t xml:space="preserve">:                      </w:t>
+        <w:t xml:space="preserve">: </w:t>
       </w:r>
       <w:r>
         <w:rPr>
@@ -2904,16 +2892,16 @@
         </w:rPr>
         <w:t>Calle I y J. J. Olmedo</w:t>
       </w:r>
-    </w:p>
-    <w:p>
-      <w:pPr>
-        <w:contextualSpacing/>
-        <w:jc w:val="both"/>
-        <w:rPr>
-          <w:sz w:val="16"/>
-          <w:szCs w:val="16"/>
-        </w:rPr>
-      </w:pPr>
+      <w:r>
+        <w:rPr>
+          <w:b/>
+          <w:bCs/>
+          <w:color w:val="EE0000"/>
+          <w:sz w:val="16"/>
+          <w:szCs w:val="16"/>
+        </w:rPr>
+        <w:t xml:space="preserve"> </w:t>
+      </w:r>
       <w:r>
         <w:rPr>
           <w:sz w:val="16"/>
@@ -2926,14 +2914,7 @@
           <w:sz w:val="16"/>
           <w:szCs w:val="16"/>
         </w:rPr>
-        <w:t xml:space="preserve"> celular:         </w:t>
-      </w:r>
-      <w:r>
-        <w:rPr>
-          <w:sz w:val="16"/>
-          <w:szCs w:val="16"/>
-        </w:rPr>
-        <w:t xml:space="preserve"> </w:t>
+        <w:t xml:space="preserve"> celular: </w:t>
       </w:r>
       <w:r>
         <w:rPr>
@@ -3973,15 +3954,6 @@
         </w:rPr>
         <w:t>Autorización expresa de las partes:</w:t>
       </w:r>
-    </w:p>
-    <w:p>
-      <w:pPr>
-        <w:contextualSpacing/>
-        <w:rPr>
-          <w:sz w:val="16"/>
-          <w:szCs w:val="16"/>
-        </w:rPr>
-      </w:pPr>
     </w:p>
     <w:p>
       <w:pPr>
@@ -4174,27 +4146,6 @@
     </w:p>
     <w:p>
       <w:pPr>
-        <w:tabs>
-          <w:tab w:val="left" w:pos="900"/>
-        </w:tabs>
-        <w:contextualSpacing/>
-        <w:rPr>
-          <w:b/>
-          <w:sz w:val="16"/>
-          <w:szCs w:val="16"/>
-        </w:rPr>
-      </w:pPr>
-      <w:r>
-        <w:rPr>
-          <w:b/>
-          <w:sz w:val="16"/>
-          <w:szCs w:val="16"/>
-        </w:rPr>
-        <w:t>*********************************************************************************************</w:t>
-      </w:r>
-    </w:p>
-    <w:p>
-      <w:pPr>
         <w:contextualSpacing/>
         <w:jc w:val="center"/>
         <w:rPr>
@@ -4214,6 +4165,14 @@
           <w:szCs w:val="16"/>
         </w:rPr>
       </w:pPr>
+      <w:r>
+        <w:rPr>
+          <w:b/>
+          <w:sz w:val="16"/>
+          <w:szCs w:val="16"/>
+        </w:rPr>
+        <w:t>ANEXO  1f</w:t>
+      </w:r>
     </w:p>
     <w:p>
       <w:pPr>
@@ -4225,190 +4184,6 @@
           <w:szCs w:val="16"/>
         </w:rPr>
       </w:pPr>
-    </w:p>
-    <w:p>
-      <w:pPr>
-        <w:contextualSpacing/>
-        <w:jc w:val="center"/>
-        <w:rPr>
-          <w:b/>
-          <w:sz w:val="16"/>
-          <w:szCs w:val="16"/>
-        </w:rPr>
-      </w:pPr>
-    </w:p>
-    <w:p>
-      <w:pPr>
-        <w:contextualSpacing/>
-        <w:jc w:val="center"/>
-        <w:rPr>
-          <w:b/>
-          <w:sz w:val="16"/>
-          <w:szCs w:val="16"/>
-        </w:rPr>
-      </w:pPr>
-    </w:p>
-    <w:p>
-      <w:pPr>
-        <w:contextualSpacing/>
-        <w:jc w:val="center"/>
-        <w:rPr>
-          <w:b/>
-          <w:sz w:val="16"/>
-          <w:szCs w:val="16"/>
-        </w:rPr>
-      </w:pPr>
-    </w:p>
-    <w:p>
-      <w:pPr>
-        <w:contextualSpacing/>
-        <w:jc w:val="center"/>
-        <w:rPr>
-          <w:b/>
-          <w:sz w:val="16"/>
-          <w:szCs w:val="16"/>
-        </w:rPr>
-      </w:pPr>
-    </w:p>
-    <w:p>
-      <w:pPr>
-        <w:contextualSpacing/>
-        <w:jc w:val="center"/>
-        <w:rPr>
-          <w:b/>
-          <w:sz w:val="16"/>
-          <w:szCs w:val="16"/>
-        </w:rPr>
-      </w:pPr>
-    </w:p>
-    <w:p>
-      <w:pPr>
-        <w:contextualSpacing/>
-        <w:jc w:val="center"/>
-        <w:rPr>
-          <w:b/>
-          <w:sz w:val="16"/>
-          <w:szCs w:val="16"/>
-        </w:rPr>
-      </w:pPr>
-    </w:p>
-    <w:p>
-      <w:pPr>
-        <w:contextualSpacing/>
-        <w:jc w:val="center"/>
-        <w:rPr>
-          <w:b/>
-          <w:sz w:val="16"/>
-          <w:szCs w:val="16"/>
-        </w:rPr>
-      </w:pPr>
-    </w:p>
-    <w:p>
-      <w:pPr>
-        <w:contextualSpacing/>
-        <w:jc w:val="center"/>
-        <w:rPr>
-          <w:b/>
-          <w:sz w:val="16"/>
-          <w:szCs w:val="16"/>
-        </w:rPr>
-      </w:pPr>
-    </w:p>
-    <w:p>
-      <w:pPr>
-        <w:contextualSpacing/>
-        <w:jc w:val="center"/>
-        <w:rPr>
-          <w:b/>
-          <w:sz w:val="16"/>
-          <w:szCs w:val="16"/>
-        </w:rPr>
-      </w:pPr>
-    </w:p>
-    <w:p>
-      <w:pPr>
-        <w:contextualSpacing/>
-        <w:jc w:val="center"/>
-        <w:rPr>
-          <w:b/>
-          <w:sz w:val="16"/>
-          <w:szCs w:val="16"/>
-        </w:rPr>
-      </w:pPr>
-    </w:p>
-    <w:p>
-      <w:pPr>
-        <w:contextualSpacing/>
-        <w:jc w:val="center"/>
-        <w:rPr>
-          <w:b/>
-          <w:sz w:val="16"/>
-          <w:szCs w:val="16"/>
-        </w:rPr>
-      </w:pPr>
-    </w:p>
-    <w:p>
-      <w:pPr>
-        <w:contextualSpacing/>
-        <w:jc w:val="center"/>
-        <w:rPr>
-          <w:b/>
-          <w:sz w:val="16"/>
-          <w:szCs w:val="16"/>
-        </w:rPr>
-      </w:pPr>
-    </w:p>
-    <w:p>
-      <w:pPr>
-        <w:contextualSpacing/>
-        <w:jc w:val="center"/>
-        <w:rPr>
-          <w:b/>
-          <w:sz w:val="16"/>
-          <w:szCs w:val="16"/>
-        </w:rPr>
-      </w:pPr>
-    </w:p>
-    <w:p>
-      <w:pPr>
-        <w:contextualSpacing/>
-        <w:jc w:val="center"/>
-        <w:rPr>
-          <w:b/>
-          <w:sz w:val="16"/>
-          <w:szCs w:val="16"/>
-        </w:rPr>
-      </w:pPr>
-    </w:p>
-    <w:p>
-      <w:pPr>
-        <w:contextualSpacing/>
-        <w:jc w:val="center"/>
-        <w:rPr>
-          <w:b/>
-          <w:sz w:val="16"/>
-          <w:szCs w:val="16"/>
-        </w:rPr>
-      </w:pPr>
-      <w:r>
-        <w:rPr>
-          <w:b/>
-          <w:sz w:val="16"/>
-          <w:szCs w:val="16"/>
-        </w:rPr>
-        <w:t>ANEXO  1f</w:t>
-      </w:r>
-    </w:p>
-    <w:p>
-      <w:pPr>
-        <w:contextualSpacing/>
-        <w:jc w:val="center"/>
-        <w:rPr>
-          <w:b/>
-          <w:sz w:val="16"/>
-          <w:szCs w:val="16"/>
-        </w:rPr>
-      </w:pPr>
       <w:r>
         <w:rPr>
           <w:b/>
@@ -5178,15 +4953,6 @@
         </w:rPr>
         <w:t>Autorización expresa de las partes:</w:t>
       </w:r>
-    </w:p>
-    <w:p>
-      <w:pPr>
-        <w:contextualSpacing/>
-        <w:rPr>
-          <w:sz w:val="16"/>
-          <w:szCs w:val="16"/>
-        </w:rPr>
-      </w:pPr>
     </w:p>
     <w:p>
       <w:pPr>
@@ -5292,6 +5058,7 @@
           <w:sz w:val="16"/>
           <w:szCs w:val="16"/>
         </w:rPr>
+        <w:lastRenderedPageBreak/>
         <w:t>-------------------------------------</w:t>
       </w:r>
       <w:r>
@@ -5363,27 +5130,6 @@
     </w:p>
     <w:p>
       <w:pPr>
-        <w:tabs>
-          <w:tab w:val="left" w:pos="900"/>
-        </w:tabs>
-        <w:contextualSpacing/>
-        <w:rPr>
-          <w:b/>
-          <w:sz w:val="16"/>
-          <w:szCs w:val="16"/>
-        </w:rPr>
-      </w:pPr>
-      <w:r>
-        <w:rPr>
-          <w:b/>
-          <w:sz w:val="16"/>
-          <w:szCs w:val="16"/>
-        </w:rPr>
-        <w:t>*********************************************************************************************</w:t>
-      </w:r>
-    </w:p>
-    <w:p>
-      <w:pPr>
         <w:contextualSpacing/>
         <w:jc w:val="center"/>
         <w:rPr>
@@ -5403,6 +5149,14 @@
           <w:szCs w:val="16"/>
         </w:rPr>
       </w:pPr>
+      <w:r>
+        <w:rPr>
+          <w:b/>
+          <w:sz w:val="16"/>
+          <w:szCs w:val="16"/>
+        </w:rPr>
+        <w:t>ANEXO 2</w:t>
+      </w:r>
     </w:p>
     <w:p>
       <w:pPr>
@@ -5414,6 +5168,402 @@
           <w:szCs w:val="16"/>
         </w:rPr>
       </w:pPr>
+      <w:r>
+        <w:rPr>
+          <w:b/>
+          <w:sz w:val="16"/>
+          <w:szCs w:val="16"/>
+        </w:rPr>
+        <w:t xml:space="preserve">ARRENDAMIENTO </w:t>
+      </w:r>
+      <w:r>
+        <w:rPr>
+          <w:b/>
+          <w:sz w:val="16"/>
+          <w:szCs w:val="16"/>
+        </w:rPr>
+        <w:t>O COMPRA DE EQUIPOS</w:t>
+      </w:r>
+    </w:p>
+    <w:p>
+      <w:pPr>
+        <w:contextualSpacing/>
+        <w:jc w:val="both"/>
+        <w:rPr>
+          <w:b/>
+          <w:color w:val="EE0000"/>
+          <w:sz w:val="16"/>
+          <w:szCs w:val="16"/>
+        </w:rPr>
+      </w:pPr>
+      <w:r>
+        <w:rPr>
+          <w:b/>
+          <w:sz w:val="16"/>
+          <w:szCs w:val="16"/>
+        </w:rPr>
+        <w:t>DETALLE Y CONDICIONES DE EQUIPOS:</w:t>
+      </w:r>
+      <w:r>
+        <w:rPr>
+          <w:b/>
+          <w:sz w:val="16"/>
+          <w:szCs w:val="16"/>
+        </w:rPr>
+        <w:t xml:space="preserve"> </w:t>
+      </w:r>
+      <w:r>
+        <w:rPr>
+          <w:bCs/>
+          <w:sz w:val="16"/>
+          <w:szCs w:val="16"/>
+        </w:rPr>
+        <w:t xml:space="preserve">CANTIDAD: </w:t>
+      </w:r>
+      <w:r>
+        <w:rPr>
+          <w:b/>
+          <w:color w:val="EE0000"/>
+          <w:sz w:val="16"/>
+          <w:szCs w:val="16"/>
+          <w:highlight w:val="yellow"/>
+        </w:rPr>
+        <w:t>1</w:t>
+      </w:r>
+      <w:r>
+        <w:rPr>
+          <w:b/>
+          <w:color w:val="EE0000"/>
+          <w:sz w:val="16"/>
+          <w:szCs w:val="16"/>
+        </w:rPr>
+        <w:t xml:space="preserve">;   </w:t>
+      </w:r>
+      <w:r>
+        <w:rPr>
+          <w:bCs/>
+          <w:sz w:val="16"/>
+          <w:szCs w:val="16"/>
+        </w:rPr>
+        <w:t xml:space="preserve">PRECIO UNITARIO:  </w:t>
+      </w:r>
+      <w:r>
+        <w:rPr>
+          <w:b/>
+          <w:color w:val="EE0000"/>
+          <w:sz w:val="16"/>
+          <w:szCs w:val="16"/>
+          <w:highlight w:val="yellow"/>
+        </w:rPr>
+        <w:t>$0.00</w:t>
+      </w:r>
+      <w:r>
+        <w:rPr>
+          <w:b/>
+          <w:color w:val="EE0000"/>
+          <w:sz w:val="16"/>
+          <w:szCs w:val="16"/>
+        </w:rPr>
+        <w:t xml:space="preserve">;  </w:t>
+      </w:r>
+      <w:r>
+        <w:rPr>
+          <w:bCs/>
+          <w:sz w:val="16"/>
+          <w:szCs w:val="16"/>
+        </w:rPr>
+        <w:t xml:space="preserve">MARCA:  X; MODELO:  X; SERIAL;  </w:t>
+      </w:r>
+      <w:r>
+        <w:rPr>
+          <w:b/>
+          <w:color w:val="EE0000"/>
+          <w:sz w:val="16"/>
+          <w:szCs w:val="16"/>
+          <w:highlight w:val="yellow"/>
+        </w:rPr>
+        <w:t>NUEVO</w:t>
+      </w:r>
+    </w:p>
+    <w:p>
+      <w:pPr>
+        <w:contextualSpacing/>
+        <w:jc w:val="both"/>
+        <w:rPr>
+          <w:bCs/>
+          <w:sz w:val="16"/>
+          <w:szCs w:val="16"/>
+        </w:rPr>
+      </w:pPr>
+      <w:r>
+        <w:rPr>
+          <w:bCs/>
+          <w:sz w:val="16"/>
+          <w:szCs w:val="16"/>
+        </w:rPr>
+        <w:t>Cliente nos compra equipos a credito</w:t>
+      </w:r>
+      <w:r>
+        <w:rPr>
+          <w:bCs/>
+          <w:sz w:val="16"/>
+          <w:szCs w:val="16"/>
+        </w:rPr>
+        <w:t xml:space="preserve">:    NO:  </w:t>
+      </w:r>
+      <w:r>
+        <w:rPr>
+          <w:b/>
+          <w:color w:val="EE0000"/>
+          <w:sz w:val="16"/>
+          <w:szCs w:val="16"/>
+          <w:highlight w:val="yellow"/>
+        </w:rPr>
+        <w:t>X</w:t>
+      </w:r>
+    </w:p>
+    <w:p>
+      <w:pPr>
+        <w:contextualSpacing/>
+        <w:jc w:val="both"/>
+        <w:rPr>
+          <w:bCs/>
+          <w:sz w:val="16"/>
+          <w:szCs w:val="16"/>
+        </w:rPr>
+      </w:pPr>
+      <w:r>
+        <w:rPr>
+          <w:bCs/>
+          <w:sz w:val="16"/>
+          <w:szCs w:val="16"/>
+        </w:rPr>
+        <w:t>Cliente nos arrienda equipos</w:t>
+      </w:r>
+      <w:r>
+        <w:rPr>
+          <w:bCs/>
+          <w:sz w:val="16"/>
+          <w:szCs w:val="16"/>
+        </w:rPr>
+        <w:t xml:space="preserve">:                      NO:  </w:t>
+      </w:r>
+      <w:r>
+        <w:rPr>
+          <w:b/>
+          <w:color w:val="EE0000"/>
+          <w:sz w:val="16"/>
+          <w:szCs w:val="16"/>
+          <w:highlight w:val="yellow"/>
+        </w:rPr>
+        <w:t>X</w:t>
+      </w:r>
+    </w:p>
+    <w:p>
+      <w:pPr>
+        <w:contextualSpacing/>
+        <w:jc w:val="both"/>
+        <w:rPr>
+          <w:bCs/>
+          <w:sz w:val="16"/>
+          <w:szCs w:val="16"/>
+        </w:rPr>
+      </w:pPr>
+      <w:r>
+        <w:rPr>
+          <w:bCs/>
+          <w:sz w:val="16"/>
+          <w:szCs w:val="16"/>
+        </w:rPr>
+        <w:t>Cliente compra equipo de contado</w:t>
+      </w:r>
+      <w:r>
+        <w:rPr>
+          <w:bCs/>
+          <w:sz w:val="16"/>
+          <w:szCs w:val="16"/>
+        </w:rPr>
+        <w:t xml:space="preserve">:          NO:  </w:t>
+      </w:r>
+      <w:r>
+        <w:rPr>
+          <w:b/>
+          <w:color w:val="EE0000"/>
+          <w:sz w:val="16"/>
+          <w:szCs w:val="16"/>
+          <w:highlight w:val="yellow"/>
+        </w:rPr>
+        <w:t>X</w:t>
+      </w:r>
+    </w:p>
+    <w:p>
+      <w:pPr>
+        <w:contextualSpacing/>
+        <w:jc w:val="both"/>
+        <w:rPr>
+          <w:b/>
+          <w:sz w:val="16"/>
+          <w:szCs w:val="16"/>
+        </w:rPr>
+      </w:pPr>
+      <w:r>
+        <w:rPr>
+          <w:bCs/>
+          <w:sz w:val="16"/>
+          <w:szCs w:val="16"/>
+        </w:rPr>
+        <w:t xml:space="preserve">VALOR MENSUAL POR ARRENDAMIENTO: </w:t>
+      </w:r>
+      <w:r>
+        <w:rPr>
+          <w:bCs/>
+          <w:sz w:val="16"/>
+          <w:szCs w:val="16"/>
+        </w:rPr>
+        <w:t xml:space="preserve">$0.00  </w:t>
+      </w:r>
+      <w:r>
+        <w:rPr>
+          <w:bCs/>
+          <w:sz w:val="16"/>
+          <w:szCs w:val="16"/>
+        </w:rPr>
+        <w:t>VALOR MENSUAL POR COMPRA A CREDITO:</w:t>
+      </w:r>
+      <w:r>
+        <w:rPr>
+          <w:bCs/>
+          <w:sz w:val="16"/>
+          <w:szCs w:val="16"/>
+        </w:rPr>
+        <w:t xml:space="preserve"> $0.00 </w:t>
+      </w:r>
+      <w:r>
+        <w:rPr>
+          <w:bCs/>
+          <w:sz w:val="16"/>
+          <w:szCs w:val="16"/>
+        </w:rPr>
+        <w:t xml:space="preserve"> CANTIDAD DE MESES POR COBRAR: $0.00 </w:t>
+      </w:r>
+    </w:p>
+    <w:p>
+      <w:pPr>
+        <w:contextualSpacing/>
+        <w:rPr>
+          <w:sz w:val="16"/>
+          <w:szCs w:val="16"/>
+        </w:rPr>
+      </w:pPr>
+      <w:r>
+        <w:rPr>
+          <w:sz w:val="16"/>
+          <w:szCs w:val="16"/>
+        </w:rPr>
+        <w:t>Autorización expresa de las partes:</w:t>
+      </w:r>
+    </w:p>
+    <w:p>
+      <w:pPr>
+        <w:contextualSpacing/>
+        <w:rPr>
+          <w:sz w:val="16"/>
+          <w:szCs w:val="16"/>
+        </w:rPr>
+      </w:pPr>
+    </w:p>
+    <w:p>
+      <w:pPr>
+        <w:contextualSpacing/>
+        <w:rPr>
+          <w:sz w:val="16"/>
+          <w:szCs w:val="16"/>
+        </w:rPr>
+      </w:pPr>
+    </w:p>
+    <w:p>
+      <w:pPr>
+        <w:contextualSpacing/>
+        <w:rPr>
+          <w:b/>
+          <w:sz w:val="16"/>
+          <w:szCs w:val="16"/>
+        </w:rPr>
+      </w:pPr>
+      <w:r>
+        <w:rPr>
+          <w:b/>
+          <w:sz w:val="16"/>
+          <w:szCs w:val="16"/>
+        </w:rPr>
+        <w:t>-------------------------------------</w:t>
+      </w:r>
+      <w:r>
+        <w:rPr>
+          <w:b/>
+          <w:sz w:val="16"/>
+          <w:szCs w:val="16"/>
+        </w:rPr>
+        <w:t xml:space="preserve">                                                                                                  </w:t>
+      </w:r>
+      <w:r>
+        <w:rPr>
+          <w:b/>
+          <w:sz w:val="16"/>
+          <w:szCs w:val="16"/>
+        </w:rPr>
+        <w:t xml:space="preserve">  ------------------------------------</w:t>
+      </w:r>
+    </w:p>
+    <w:p>
+      <w:pPr>
+        <w:contextualSpacing/>
+        <w:rPr>
+          <w:b/>
+          <w:sz w:val="16"/>
+          <w:szCs w:val="16"/>
+        </w:rPr>
+      </w:pPr>
+      <w:r>
+        <w:rPr>
+          <w:b/>
+          <w:sz w:val="16"/>
+          <w:szCs w:val="16"/>
+        </w:rPr>
+        <w:t xml:space="preserve">GOBRAVCORP/PRESTADOR      </w:t>
+      </w:r>
+      <w:r>
+        <w:rPr>
+          <w:b/>
+          <w:sz w:val="16"/>
+          <w:szCs w:val="16"/>
+        </w:rPr>
+        <w:t xml:space="preserve">     </w:t>
+      </w:r>
+      <w:r>
+        <w:rPr>
+          <w:b/>
+          <w:sz w:val="16"/>
+          <w:szCs w:val="16"/>
+        </w:rPr>
+        <w:t xml:space="preserve">   </w:t>
+      </w:r>
+      <w:r>
+        <w:rPr>
+          <w:b/>
+          <w:sz w:val="16"/>
+          <w:szCs w:val="16"/>
+        </w:rPr>
+        <w:t xml:space="preserve">                                                                                     </w:t>
+      </w:r>
+      <w:r>
+        <w:rPr>
+          <w:b/>
+          <w:sz w:val="16"/>
+          <w:szCs w:val="16"/>
+        </w:rPr>
+        <w:t xml:space="preserve"> ABONADO/SUBSCRIPTOR</w:t>
+      </w:r>
     </w:p>
     <w:p>
       <w:pPr>
@@ -5436,6 +5586,14 @@
           <w:szCs w:val="16"/>
         </w:rPr>
       </w:pPr>
+      <w:r>
+        <w:rPr>
+          <w:b/>
+          <w:sz w:val="16"/>
+          <w:szCs w:val="16"/>
+        </w:rPr>
+        <w:t>ANEXO 3</w:t>
+      </w:r>
     </w:p>
     <w:p>
       <w:pPr>
@@ -5447,51 +5605,13 @@
           <w:szCs w:val="16"/>
         </w:rPr>
       </w:pPr>
-    </w:p>
-    <w:p>
-      <w:pPr>
-        <w:contextualSpacing/>
-        <w:jc w:val="center"/>
-        <w:rPr>
-          <w:b/>
-          <w:sz w:val="16"/>
-          <w:szCs w:val="16"/>
-        </w:rPr>
-      </w:pPr>
-      <w:r>
-        <w:rPr>
-          <w:b/>
-          <w:sz w:val="16"/>
-          <w:szCs w:val="16"/>
-        </w:rPr>
-        <w:t>ANEXO 2</w:t>
-      </w:r>
-    </w:p>
-    <w:p>
-      <w:pPr>
-        <w:contextualSpacing/>
-        <w:jc w:val="center"/>
-        <w:rPr>
-          <w:b/>
-          <w:sz w:val="16"/>
-          <w:szCs w:val="16"/>
-        </w:rPr>
-      </w:pPr>
-      <w:r>
-        <w:rPr>
-          <w:b/>
-          <w:sz w:val="16"/>
-          <w:szCs w:val="16"/>
-        </w:rPr>
-        <w:t xml:space="preserve">ARRENDAMIENTO </w:t>
-      </w:r>
-      <w:r>
-        <w:rPr>
-          <w:b/>
-          <w:sz w:val="16"/>
-          <w:szCs w:val="16"/>
-        </w:rPr>
-        <w:t>O COMPRA DE EQUIPOS</w:t>
+      <w:r>
+        <w:rPr>
+          <w:b/>
+          <w:sz w:val="16"/>
+          <w:szCs w:val="16"/>
+        </w:rPr>
+        <w:t>ACTA DE INSTALACION Y ACTIVACION</w:t>
       </w:r>
     </w:p>
     <w:p>
@@ -5500,98 +5620,27 @@
         <w:jc w:val="both"/>
         <w:rPr>
           <w:b/>
-          <w:color w:val="EE0000"/>
-          <w:sz w:val="16"/>
-          <w:szCs w:val="16"/>
-        </w:rPr>
-      </w:pPr>
-      <w:r>
-        <w:rPr>
-          <w:b/>
-          <w:sz w:val="16"/>
-          <w:szCs w:val="16"/>
-        </w:rPr>
-        <w:t>DETALLE Y CONDICIONES DE EQUIPOS:</w:t>
-      </w:r>
-      <w:r>
-        <w:rPr>
-          <w:b/>
-          <w:sz w:val="16"/>
-          <w:szCs w:val="16"/>
-        </w:rPr>
-        <w:t xml:space="preserve"> </w:t>
-      </w:r>
-      <w:r>
-        <w:rPr>
-          <w:bCs/>
-          <w:sz w:val="16"/>
-          <w:szCs w:val="16"/>
-        </w:rPr>
-        <w:t xml:space="preserve">CANTIDAD: </w:t>
-      </w:r>
-      <w:r>
-        <w:rPr>
-          <w:b/>
-          <w:color w:val="EE0000"/>
-          <w:sz w:val="16"/>
-          <w:szCs w:val="16"/>
-          <w:highlight w:val="yellow"/>
-        </w:rPr>
-        <w:t>1</w:t>
-      </w:r>
-      <w:r>
-        <w:rPr>
-          <w:b/>
-          <w:color w:val="EE0000"/>
-          <w:sz w:val="16"/>
-          <w:szCs w:val="16"/>
-        </w:rPr>
-        <w:t xml:space="preserve">;   </w:t>
-      </w:r>
-      <w:r>
-        <w:rPr>
-          <w:bCs/>
-          <w:sz w:val="16"/>
-          <w:szCs w:val="16"/>
-        </w:rPr>
-        <w:t xml:space="preserve">PRECIO UNITARIO:  </w:t>
-      </w:r>
-      <w:r>
-        <w:rPr>
-          <w:b/>
-          <w:color w:val="EE0000"/>
-          <w:sz w:val="16"/>
-          <w:szCs w:val="16"/>
-          <w:highlight w:val="yellow"/>
-        </w:rPr>
-        <w:t>$0.00</w:t>
-      </w:r>
-      <w:r>
-        <w:rPr>
-          <w:b/>
-          <w:color w:val="EE0000"/>
-          <w:sz w:val="16"/>
-          <w:szCs w:val="16"/>
-        </w:rPr>
-        <w:t xml:space="preserve">;  </w:t>
-      </w:r>
-      <w:r>
-        <w:rPr>
-          <w:bCs/>
-          <w:sz w:val="16"/>
-          <w:szCs w:val="16"/>
-        </w:rPr>
-        <w:t xml:space="preserve">MARCA:  X; MODELO:  X; SERIAL;  </w:t>
-      </w:r>
-      <w:r>
-        <w:rPr>
-          <w:b/>
-          <w:color w:val="EE0000"/>
-          <w:sz w:val="16"/>
-          <w:szCs w:val="16"/>
-          <w:highlight w:val="yellow"/>
-        </w:rPr>
-        <w:t>NUEVO</w:t>
+          <w:sz w:val="16"/>
+          <w:szCs w:val="16"/>
+        </w:rPr>
+      </w:pPr>
+      <w:r>
+        <w:rPr>
+          <w:b/>
+          <w:sz w:val="16"/>
+          <w:szCs w:val="16"/>
+        </w:rPr>
+        <w:t xml:space="preserve">Fecha y hora de la instalación:  </w:t>
+      </w:r>
+      <w:r>
+        <w:rPr>
+          <w:b/>
+          <w:color w:val="EE0000"/>
+          <w:sz w:val="16"/>
+          <w:szCs w:val="16"/>
+          <w:highlight w:val="yellow"/>
+        </w:rPr>
+        <w:t>${fechaContrato}</w:t>
       </w:r>
     </w:p>
     <w:p>
@@ -5599,26 +5648,93 @@
         <w:contextualSpacing/>
         <w:jc w:val="both"/>
         <w:rPr>
-          <w:bCs/>
-          <w:sz w:val="16"/>
-          <w:szCs w:val="16"/>
-        </w:rPr>
-      </w:pPr>
-      <w:r>
-        <w:rPr>
-          <w:bCs/>
-          <w:sz w:val="16"/>
-          <w:szCs w:val="16"/>
-        </w:rPr>
-        <w:t>Cliente nos compra equipos a credito</w:t>
-      </w:r>
-      <w:r>
-        <w:rPr>
-          <w:bCs/>
-          <w:sz w:val="16"/>
-          <w:szCs w:val="16"/>
-        </w:rPr>
-        <w:t xml:space="preserve">:    NO:  </w:t>
+          <w:b/>
+          <w:sz w:val="16"/>
+          <w:szCs w:val="16"/>
+        </w:rPr>
+      </w:pPr>
+      <w:r>
+        <w:rPr>
+          <w:b/>
+          <w:sz w:val="16"/>
+          <w:szCs w:val="16"/>
+        </w:rPr>
+        <w:t xml:space="preserve">Lugar de la instalación:               </w:t>
+      </w:r>
+      <w:r>
+        <w:rPr>
+          <w:b/>
+          <w:bCs/>
+          <w:color w:val="FF0000"/>
+          <w:sz w:val="16"/>
+          <w:szCs w:val="16"/>
+          <w:highlight w:val="yellow"/>
+        </w:rPr>
+        <w:t>${direccionServicio}</w:t>
+      </w:r>
+    </w:p>
+    <w:p>
+      <w:pPr>
+        <w:contextualSpacing/>
+        <w:rPr>
+          <w:b/>
+          <w:color w:val="EE0000"/>
+          <w:sz w:val="16"/>
+          <w:szCs w:val="16"/>
+        </w:rPr>
+      </w:pPr>
+      <w:r>
+        <w:rPr>
+          <w:b/>
+          <w:sz w:val="16"/>
+          <w:szCs w:val="16"/>
+        </w:rPr>
+        <w:t xml:space="preserve">IP asignada al cliente:                  </w:t>
+      </w:r>
+      <w:r>
+        <w:rPr>
+          <w:b/>
+          <w:color w:val="EE0000"/>
+          <w:sz w:val="16"/>
+          <w:szCs w:val="16"/>
+          <w:highlight w:val="yellow"/>
+        </w:rPr>
+        <w:t>${ipUsuario}</w:t>
+      </w:r>
+    </w:p>
+    <w:p>
+      <w:pPr>
+        <w:contextualSpacing/>
+        <w:rPr>
+          <w:b/>
+          <w:color w:val="EE0000"/>
+          <w:sz w:val="16"/>
+          <w:szCs w:val="16"/>
+        </w:rPr>
+      </w:pPr>
+      <w:r>
+        <w:rPr>
+          <w:bCs/>
+          <w:sz w:val="16"/>
+          <w:szCs w:val="16"/>
+        </w:rPr>
+        <w:t xml:space="preserve">Cliente verificó ancho de banda instalado: </w:t>
+      </w:r>
+      <w:r>
+        <w:rPr>
+          <w:bCs/>
+          <w:sz w:val="16"/>
+          <w:szCs w:val="16"/>
+        </w:rPr>
+        <w:t xml:space="preserve">           </w:t>
+      </w:r>
+      <w:r>
+        <w:rPr>
+          <w:bCs/>
+          <w:sz w:val="16"/>
+          <w:szCs w:val="16"/>
+        </w:rPr>
+        <w:t xml:space="preserve">SI:        </w:t>
       </w:r>
       <w:r>
         <w:rPr>
@@ -5634,232 +5750,181 @@
     <w:p>
       <w:pPr>
         <w:contextualSpacing/>
+        <w:rPr>
+          <w:bCs/>
+          <w:sz w:val="16"/>
+          <w:szCs w:val="16"/>
+        </w:rPr>
+      </w:pPr>
+      <w:r>
+        <w:rPr>
+          <w:bCs/>
+          <w:sz w:val="16"/>
+          <w:szCs w:val="16"/>
+        </w:rPr>
+        <w:t>Características de la computadora del cliente:</w:t>
+      </w:r>
+    </w:p>
+    <w:p>
+      <w:pPr>
+        <w:contextualSpacing/>
+        <w:rPr>
+          <w:b/>
+          <w:color w:val="EE0000"/>
+          <w:sz w:val="16"/>
+          <w:szCs w:val="16"/>
+        </w:rPr>
+      </w:pPr>
+      <w:r>
+        <w:rPr>
+          <w:bCs/>
+          <w:sz w:val="16"/>
+          <w:szCs w:val="16"/>
+        </w:rPr>
+        <w:t xml:space="preserve">Cliente tiene puesta a tierra:                                    NO:      </w:t>
+      </w:r>
+      <w:r>
+        <w:rPr>
+          <w:b/>
+          <w:color w:val="EE0000"/>
+          <w:sz w:val="16"/>
+          <w:szCs w:val="16"/>
+          <w:highlight w:val="yellow"/>
+        </w:rPr>
+        <w:t>X</w:t>
+      </w:r>
+    </w:p>
+    <w:p>
+      <w:pPr>
+        <w:contextualSpacing/>
+        <w:rPr>
+          <w:b/>
+          <w:color w:val="EE0000"/>
+          <w:sz w:val="16"/>
+          <w:szCs w:val="16"/>
+        </w:rPr>
+      </w:pPr>
+      <w:r>
+        <w:rPr>
+          <w:bCs/>
+          <w:sz w:val="16"/>
+          <w:szCs w:val="16"/>
+        </w:rPr>
+        <w:t xml:space="preserve">Cliente pide bloqueo de páginas web:                    NO:      </w:t>
+      </w:r>
+      <w:r>
+        <w:rPr>
+          <w:b/>
+          <w:color w:val="EE0000"/>
+          <w:sz w:val="16"/>
+          <w:szCs w:val="16"/>
+          <w:highlight w:val="yellow"/>
+        </w:rPr>
+        <w:t>X</w:t>
+      </w:r>
+    </w:p>
+    <w:p>
+      <w:pPr>
+        <w:contextualSpacing/>
+        <w:rPr>
+          <w:b/>
+          <w:color w:val="EE0000"/>
+          <w:sz w:val="16"/>
+          <w:szCs w:val="16"/>
+        </w:rPr>
+      </w:pPr>
+      <w:r>
+        <w:rPr>
+          <w:bCs/>
+          <w:sz w:val="16"/>
+          <w:szCs w:val="16"/>
+        </w:rPr>
+        <w:t xml:space="preserve">Cliente pide bloqueo de servicios:                           NO:      </w:t>
+      </w:r>
+      <w:r>
+        <w:rPr>
+          <w:b/>
+          <w:color w:val="EE0000"/>
+          <w:sz w:val="16"/>
+          <w:szCs w:val="16"/>
+          <w:highlight w:val="yellow"/>
+        </w:rPr>
+        <w:t>X</w:t>
+      </w:r>
+    </w:p>
+    <w:p>
+      <w:pPr>
+        <w:contextualSpacing/>
+        <w:rPr>
+          <w:b/>
+          <w:color w:val="EE0000"/>
+          <w:sz w:val="16"/>
+          <w:szCs w:val="16"/>
+        </w:rPr>
+      </w:pPr>
+      <w:r>
+        <w:rPr>
+          <w:bCs/>
+          <w:sz w:val="16"/>
+          <w:szCs w:val="16"/>
+        </w:rPr>
+        <w:t xml:space="preserve">Cliente pide bloqueo de puertos:                             NO:      </w:t>
+      </w:r>
+      <w:r>
+        <w:rPr>
+          <w:b/>
+          <w:color w:val="EE0000"/>
+          <w:sz w:val="16"/>
+          <w:szCs w:val="16"/>
+          <w:highlight w:val="yellow"/>
+        </w:rPr>
+        <w:t>X</w:t>
+      </w:r>
+    </w:p>
+    <w:p>
+      <w:pPr>
+        <w:contextualSpacing/>
+        <w:rPr>
+          <w:b/>
+          <w:color w:val="EE0000"/>
+          <w:sz w:val="16"/>
+          <w:szCs w:val="16"/>
+        </w:rPr>
+      </w:pPr>
+      <w:r>
+        <w:rPr>
+          <w:bCs/>
+          <w:sz w:val="16"/>
+          <w:szCs w:val="16"/>
+        </w:rPr>
+        <w:t>Detalle de material utilizado para instalación por parte de prestador: ROUTER WIFI; CABLE DE RED; CONECTORES; FIBRA OPTICA</w:t>
+      </w:r>
+    </w:p>
+    <w:p>
+      <w:pPr>
+        <w:contextualSpacing/>
+        <w:rPr>
+          <w:sz w:val="16"/>
+          <w:szCs w:val="16"/>
+        </w:rPr>
+      </w:pPr>
+      <w:r>
+        <w:rPr>
+          <w:sz w:val="16"/>
+          <w:szCs w:val="16"/>
+        </w:rPr>
+        <w:t>Autorización expresa de las partes:</w:t>
+      </w:r>
+    </w:p>
+    <w:p>
+      <w:pPr>
+        <w:contextualSpacing/>
         <w:jc w:val="both"/>
         <w:rPr>
-          <w:bCs/>
-          <w:sz w:val="16"/>
-          <w:szCs w:val="16"/>
-        </w:rPr>
-      </w:pPr>
-      <w:r>
-        <w:rPr>
-          <w:bCs/>
-          <w:sz w:val="16"/>
-          <w:szCs w:val="16"/>
-        </w:rPr>
-        <w:t>Cliente nos arrienda equipos</w:t>
-      </w:r>
-      <w:r>
-        <w:rPr>
-          <w:bCs/>
-          <w:sz w:val="16"/>
-          <w:szCs w:val="16"/>
-        </w:rPr>
-        <w:t xml:space="preserve">:                      NO:  </w:t>
-      </w:r>
-      <w:r>
-        <w:rPr>
-          <w:b/>
-          <w:color w:val="EE0000"/>
-          <w:sz w:val="16"/>
-          <w:szCs w:val="16"/>
-          <w:highlight w:val="yellow"/>
-        </w:rPr>
-        <w:t>X</w:t>
-      </w:r>
-    </w:p>
-    <w:p>
-      <w:pPr>
-        <w:contextualSpacing/>
-        <w:jc w:val="both"/>
-        <w:rPr>
-          <w:bCs/>
-          <w:sz w:val="16"/>
-          <w:szCs w:val="16"/>
-        </w:rPr>
-      </w:pPr>
-      <w:r>
-        <w:rPr>
-          <w:bCs/>
-          <w:sz w:val="16"/>
-          <w:szCs w:val="16"/>
-        </w:rPr>
-        <w:t>Cliente compra equipo de contado</w:t>
-      </w:r>
-      <w:r>
-        <w:rPr>
-          <w:bCs/>
-          <w:sz w:val="16"/>
-          <w:szCs w:val="16"/>
-        </w:rPr>
-        <w:t xml:space="preserve">:          NO:  </w:t>
-      </w:r>
-      <w:r>
-        <w:rPr>
-          <w:b/>
-          <w:color w:val="EE0000"/>
-          <w:sz w:val="16"/>
-          <w:szCs w:val="16"/>
-          <w:highlight w:val="yellow"/>
-        </w:rPr>
-        <w:t>X</w:t>
-      </w:r>
-    </w:p>
-    <w:p>
-      <w:pPr>
-        <w:contextualSpacing/>
-        <w:jc w:val="both"/>
-        <w:rPr>
-          <w:b/>
-          <w:sz w:val="16"/>
-          <w:szCs w:val="16"/>
-        </w:rPr>
-      </w:pPr>
-      <w:r>
-        <w:rPr>
-          <w:bCs/>
-          <w:sz w:val="16"/>
-          <w:szCs w:val="16"/>
-        </w:rPr>
-        <w:t xml:space="preserve">VALOR MENSUAL POR ARRENDAMIENTO: </w:t>
-      </w:r>
-      <w:r>
-        <w:rPr>
-          <w:bCs/>
-          <w:sz w:val="16"/>
-          <w:szCs w:val="16"/>
-        </w:rPr>
-        <w:t xml:space="preserve">$0.00  </w:t>
-      </w:r>
-      <w:r>
-        <w:rPr>
-          <w:bCs/>
-          <w:sz w:val="16"/>
-          <w:szCs w:val="16"/>
-        </w:rPr>
-        <w:t>VALOR MENSUAL POR COMPRA A CREDITO:</w:t>
-      </w:r>
-      <w:r>
-        <w:rPr>
-          <w:bCs/>
-          <w:sz w:val="16"/>
-          <w:szCs w:val="16"/>
-        </w:rPr>
-        <w:t xml:space="preserve"> $0.00 </w:t>
-      </w:r>
-      <w:r>
-        <w:rPr>
-          <w:bCs/>
-          <w:sz w:val="16"/>
-          <w:szCs w:val="16"/>
-        </w:rPr>
-        <w:t xml:space="preserve"> CANTIDAD DE MESES POR COBRAR: $0.00 </w:t>
-      </w:r>
-    </w:p>
-    <w:p>
-      <w:pPr>
-        <w:contextualSpacing/>
-        <w:rPr>
-          <w:sz w:val="16"/>
-          <w:szCs w:val="16"/>
-        </w:rPr>
-      </w:pPr>
-      <w:r>
-        <w:rPr>
-          <w:sz w:val="16"/>
-          <w:szCs w:val="16"/>
-        </w:rPr>
-        <w:t>Autorización expresa de las partes:</w:t>
-      </w:r>
-    </w:p>
-    <w:p>
-      <w:pPr>
-        <w:contextualSpacing/>
-        <w:rPr>
-          <w:sz w:val="16"/>
-          <w:szCs w:val="16"/>
-        </w:rPr>
-      </w:pPr>
-    </w:p>
-    <w:p>
-      <w:pPr>
-        <w:contextualSpacing/>
-        <w:jc w:val="both"/>
-        <w:rPr>
-          <w:sz w:val="16"/>
-          <w:szCs w:val="16"/>
-        </w:rPr>
-      </w:pPr>
-      <w:r>
-        <w:rPr>
-          <w:noProof/>
-          <w:sz w:val="16"/>
-          <w:szCs w:val="16"/>
-        </w:rPr>
-        <w:drawing>
-          <wp:anchor distT="0" distB="0" distL="114300" distR="114300" simplePos="0" relativeHeight="251764736" behindDoc="1" locked="0" layoutInCell="1" allowOverlap="1" wp14:anchorId="43F64A34" wp14:editId="5A89927E">
-            <wp:simplePos x="0" y="0"/>
-            <wp:positionH relativeFrom="margin">
-              <wp:posOffset>340241</wp:posOffset>
-            </wp:positionH>
-            <wp:positionV relativeFrom="paragraph">
-              <wp:posOffset>48289</wp:posOffset>
-            </wp:positionV>
-            <wp:extent cx="381635" cy="140970"/>
-            <wp:effectExtent l="0" t="0" r="0" b="0"/>
-            <wp:wrapTight wrapText="bothSides">
-              <wp:wrapPolygon edited="0">
-                <wp:start x="0" y="0"/>
-                <wp:lineTo x="0" y="17514"/>
-                <wp:lineTo x="20486" y="17514"/>
-                <wp:lineTo x="20486" y="0"/>
-                <wp:lineTo x="0" y="0"/>
-              </wp:wrapPolygon>
-            </wp:wrapTight>
-            <wp:docPr id="251872721" name="Imagen 1"/>
-            <wp:cNvGraphicFramePr>
-              <a:graphicFrameLocks xmlns:a="http://schemas.openxmlformats.org/drawingml/2006/main" noChangeAspect="1"/>
-            </wp:cNvGraphicFramePr>
-            <a:graphic xmlns:a="http://schemas.openxmlformats.org/drawingml/2006/main">
-              <a:graphicData uri="http://schemas.openxmlformats.org/drawingml/2006/picture">
-                <pic:pic xmlns:pic="http://schemas.openxmlformats.org/drawingml/2006/picture">
-                  <pic:nvPicPr>
-                    <pic:cNvPr id="1970752238" name=""/>
-                    <pic:cNvPicPr/>
-                  </pic:nvPicPr>
-                  <pic:blipFill>
-                    <a:blip r:embed="rId8" cstate="print">
-                      <a:extLst>
-                        <a:ext uri="{28A0092B-C50C-407E-A947-70E740481C1C}">
-                          <a14:useLocalDpi xmlns:a14="http://schemas.microsoft.com/office/drawing/2010/main" val="0"/>
-                        </a:ext>
-                      </a:extLst>
-                    </a:blip>
-                    <a:stretch>
-                      <a:fillRect/>
-                    </a:stretch>
-                  </pic:blipFill>
-                  <pic:spPr>
-                    <a:xfrm>
-                      <a:off x="0" y="0"/>
-                      <a:ext cx="381635" cy="140970"/>
-                    </a:xfrm>
-                    <a:prstGeom prst="rect">
-                      <a:avLst/>
-                    </a:prstGeom>
-                  </pic:spPr>
-                </pic:pic>
-              </a:graphicData>
-            </a:graphic>
-            <wp14:sizeRelH relativeFrom="margin">
-              <wp14:pctWidth>0</wp14:pctWidth>
-            </wp14:sizeRelH>
-            <wp14:sizeRelV relativeFrom="margin">
-              <wp14:pctHeight>0</wp14:pctHeight>
-            </wp14:sizeRelV>
-          </wp:anchor>
-        </w:drawing>
-      </w:r>
+          <w:sz w:val="16"/>
+          <w:szCs w:val="16"/>
+        </w:rPr>
+      </w:pPr>
     </w:p>
     <w:p>
       <w:pPr>
@@ -5952,570 +6017,6 @@
           <w:szCs w:val="16"/>
         </w:rPr>
         <w:t xml:space="preserve"> ABONADO/SUBSCRIPTOR</w:t>
-      </w:r>
-    </w:p>
-    <w:p>
-      <w:pPr>
-        <w:tabs>
-          <w:tab w:val="left" w:pos="900"/>
-        </w:tabs>
-        <w:contextualSpacing/>
-        <w:rPr>
-          <w:b/>
-          <w:sz w:val="16"/>
-          <w:szCs w:val="16"/>
-        </w:rPr>
-      </w:pPr>
-      <w:r>
-        <w:rPr>
-          <w:b/>
-          <w:sz w:val="16"/>
-          <w:szCs w:val="16"/>
-        </w:rPr>
-        <w:t>*********************************************************************************************</w:t>
-      </w:r>
-    </w:p>
-    <w:p>
-      <w:pPr>
-        <w:contextualSpacing/>
-        <w:jc w:val="center"/>
-        <w:rPr>
-          <w:b/>
-          <w:sz w:val="16"/>
-          <w:szCs w:val="16"/>
-        </w:rPr>
-      </w:pPr>
-      <w:r>
-        <w:rPr>
-          <w:b/>
-          <w:sz w:val="16"/>
-          <w:szCs w:val="16"/>
-        </w:rPr>
-        <w:t>ANEXO 3</w:t>
-      </w:r>
-    </w:p>
-    <w:p>
-      <w:pPr>
-        <w:contextualSpacing/>
-        <w:jc w:val="center"/>
-        <w:rPr>
-          <w:b/>
-          <w:sz w:val="16"/>
-          <w:szCs w:val="16"/>
-        </w:rPr>
-      </w:pPr>
-      <w:r>
-        <w:rPr>
-          <w:b/>
-          <w:sz w:val="16"/>
-          <w:szCs w:val="16"/>
-        </w:rPr>
-        <w:t>ACTA DE INSTALACION Y ACTIVACION</w:t>
-      </w:r>
-    </w:p>
-    <w:p>
-      <w:pPr>
-        <w:contextualSpacing/>
-        <w:jc w:val="both"/>
-        <w:rPr>
-          <w:b/>
-          <w:sz w:val="16"/>
-          <w:szCs w:val="16"/>
-        </w:rPr>
-      </w:pPr>
-      <w:r>
-        <w:rPr>
-          <w:b/>
-          <w:sz w:val="16"/>
-          <w:szCs w:val="16"/>
-        </w:rPr>
-        <w:t xml:space="preserve">Fecha y hora de la instalación:  </w:t>
-      </w:r>
-      <w:r>
-        <w:rPr>
-          <w:b/>
-          <w:color w:val="EE0000"/>
-          <w:sz w:val="16"/>
-          <w:szCs w:val="16"/>
-          <w:highlight w:val="yellow"/>
-        </w:rPr>
-        <w:t>${fechaContrato}</w:t>
-      </w:r>
-    </w:p>
-    <w:p>
-      <w:pPr>
-        <w:contextualSpacing/>
-        <w:jc w:val="both"/>
-        <w:rPr>
-          <w:b/>
-          <w:sz w:val="16"/>
-          <w:szCs w:val="16"/>
-        </w:rPr>
-      </w:pPr>
-      <w:r>
-        <w:rPr>
-          <w:b/>
-          <w:sz w:val="16"/>
-          <w:szCs w:val="16"/>
-        </w:rPr>
-        <w:t xml:space="preserve">Lugar de la instalación:               </w:t>
-      </w:r>
-      <w:r>
-        <w:rPr>
-          <w:b/>
-          <w:bCs/>
-          <w:color w:val="FF0000"/>
-          <w:sz w:val="16"/>
-          <w:szCs w:val="16"/>
-          <w:highlight w:val="yellow"/>
-        </w:rPr>
-        <w:t>${direccionServicio}</w:t>
-      </w:r>
-    </w:p>
-    <w:p>
-      <w:pPr>
-        <w:contextualSpacing/>
-        <w:rPr>
-          <w:b/>
-          <w:color w:val="EE0000"/>
-          <w:sz w:val="16"/>
-          <w:szCs w:val="16"/>
-        </w:rPr>
-      </w:pPr>
-      <w:r>
-        <w:rPr>
-          <w:b/>
-          <w:sz w:val="16"/>
-          <w:szCs w:val="16"/>
-        </w:rPr>
-        <w:t xml:space="preserve">IP asignada al cliente:                  </w:t>
-      </w:r>
-      <w:r>
-        <w:rPr>
-          <w:b/>
-          <w:color w:val="EE0000"/>
-          <w:sz w:val="16"/>
-          <w:szCs w:val="16"/>
-          <w:highlight w:val="yellow"/>
-        </w:rPr>
-        <w:t>${ipUsuario}</w:t>
-      </w:r>
-    </w:p>
-    <w:p>
-      <w:pPr>
-        <w:contextualSpacing/>
-        <w:rPr>
-          <w:b/>
-          <w:color w:val="EE0000"/>
-          <w:sz w:val="16"/>
-          <w:szCs w:val="16"/>
-        </w:rPr>
-      </w:pPr>
-      <w:r>
-        <w:rPr>
-          <w:bCs/>
-          <w:sz w:val="16"/>
-          <w:szCs w:val="16"/>
-        </w:rPr>
-        <w:t xml:space="preserve">Cliente verificó ancho de banda instalado: </w:t>
-      </w:r>
-      <w:r>
-        <w:rPr>
-          <w:bCs/>
-          <w:sz w:val="16"/>
-          <w:szCs w:val="16"/>
-        </w:rPr>
-        <w:t xml:space="preserve">           </w:t>
-      </w:r>
-      <w:r>
-        <w:rPr>
-          <w:bCs/>
-          <w:sz w:val="16"/>
-          <w:szCs w:val="16"/>
-        </w:rPr>
-        <w:t xml:space="preserve">SI:        </w:t>
-      </w:r>
-      <w:r>
-        <w:rPr>
-          <w:b/>
-          <w:color w:val="EE0000"/>
-          <w:sz w:val="16"/>
-          <w:szCs w:val="16"/>
-          <w:highlight w:val="yellow"/>
-        </w:rPr>
-        <w:t>X</w:t>
-      </w:r>
-    </w:p>
-    <w:p>
-      <w:pPr>
-        <w:contextualSpacing/>
-        <w:rPr>
-          <w:bCs/>
-          <w:sz w:val="16"/>
-          <w:szCs w:val="16"/>
-        </w:rPr>
-      </w:pPr>
-      <w:r>
-        <w:rPr>
-          <w:bCs/>
-          <w:sz w:val="16"/>
-          <w:szCs w:val="16"/>
-        </w:rPr>
-        <w:t>Características de la computadora del cliente:</w:t>
-      </w:r>
-    </w:p>
-    <w:p>
-      <w:pPr>
-        <w:contextualSpacing/>
-        <w:rPr>
-          <w:b/>
-          <w:color w:val="EE0000"/>
-          <w:sz w:val="16"/>
-          <w:szCs w:val="16"/>
-        </w:rPr>
-      </w:pPr>
-      <w:r>
-        <w:rPr>
-          <w:bCs/>
-          <w:sz w:val="16"/>
-          <w:szCs w:val="16"/>
-        </w:rPr>
-        <w:t xml:space="preserve">Cliente tiene puesta a tierra:                                    NO:      </w:t>
-      </w:r>
-      <w:r>
-        <w:rPr>
-          <w:b/>
-          <w:color w:val="EE0000"/>
-          <w:sz w:val="16"/>
-          <w:szCs w:val="16"/>
-          <w:highlight w:val="yellow"/>
-        </w:rPr>
-        <w:t>X</w:t>
-      </w:r>
-    </w:p>
-    <w:p>
-      <w:pPr>
-        <w:contextualSpacing/>
-        <w:rPr>
-          <w:b/>
-          <w:color w:val="EE0000"/>
-          <w:sz w:val="16"/>
-          <w:szCs w:val="16"/>
-        </w:rPr>
-      </w:pPr>
-      <w:r>
-        <w:rPr>
-          <w:bCs/>
-          <w:sz w:val="16"/>
-          <w:szCs w:val="16"/>
-        </w:rPr>
-        <w:t xml:space="preserve">Cliente pide bloqueo de páginas web:                    NO:      </w:t>
-      </w:r>
-      <w:r>
-        <w:rPr>
-          <w:b/>
-          <w:color w:val="EE0000"/>
-          <w:sz w:val="16"/>
-          <w:szCs w:val="16"/>
-          <w:highlight w:val="yellow"/>
-        </w:rPr>
-        <w:t>X</w:t>
-      </w:r>
-    </w:p>
-    <w:p>
-      <w:pPr>
-        <w:contextualSpacing/>
-        <w:rPr>
-          <w:b/>
-          <w:color w:val="EE0000"/>
-          <w:sz w:val="16"/>
-          <w:szCs w:val="16"/>
-        </w:rPr>
-      </w:pPr>
-      <w:r>
-        <w:rPr>
-          <w:bCs/>
-          <w:sz w:val="16"/>
-          <w:szCs w:val="16"/>
-        </w:rPr>
-        <w:t xml:space="preserve">Cliente pide bloqueo de servicios:                           NO:      </w:t>
-      </w:r>
-      <w:r>
-        <w:rPr>
-          <w:b/>
-          <w:color w:val="EE0000"/>
-          <w:sz w:val="16"/>
-          <w:szCs w:val="16"/>
-          <w:highlight w:val="yellow"/>
-        </w:rPr>
-        <w:t>X</w:t>
-      </w:r>
-    </w:p>
-    <w:p>
-      <w:pPr>
-        <w:contextualSpacing/>
-        <w:rPr>
-          <w:b/>
-          <w:color w:val="EE0000"/>
-          <w:sz w:val="16"/>
-          <w:szCs w:val="16"/>
-        </w:rPr>
-      </w:pPr>
-      <w:r>
-        <w:rPr>
-          <w:bCs/>
-          <w:sz w:val="16"/>
-          <w:szCs w:val="16"/>
-        </w:rPr>
-        <w:t xml:space="preserve">Cliente pide bloqueo de puertos:                             NO:      </w:t>
-      </w:r>
-      <w:r>
-        <w:rPr>
-          <w:b/>
-          <w:color w:val="EE0000"/>
-          <w:sz w:val="16"/>
-          <w:szCs w:val="16"/>
-          <w:highlight w:val="yellow"/>
-        </w:rPr>
-        <w:t>X</w:t>
-      </w:r>
-    </w:p>
-    <w:p>
-      <w:pPr>
-        <w:contextualSpacing/>
-        <w:rPr>
-          <w:b/>
-          <w:color w:val="EE0000"/>
-          <w:sz w:val="16"/>
-          <w:szCs w:val="16"/>
-        </w:rPr>
-      </w:pPr>
-      <w:r>
-        <w:rPr>
-          <w:bCs/>
-          <w:sz w:val="16"/>
-          <w:szCs w:val="16"/>
-        </w:rPr>
-        <w:t>Detalle de material utilizado para instalación por parte de prestador: ROUTER WIFI; CABLE DE RED; CONECTORES; FIBRA OPTICA</w:t>
-      </w:r>
-    </w:p>
-    <w:p>
-      <w:pPr>
-        <w:contextualSpacing/>
-        <w:rPr>
-          <w:sz w:val="16"/>
-          <w:szCs w:val="16"/>
-        </w:rPr>
-      </w:pPr>
-      <w:r>
-        <w:rPr>
-          <w:sz w:val="16"/>
-          <w:szCs w:val="16"/>
-        </w:rPr>
-        <w:t>Autorización expresa de las partes:</w:t>
-      </w:r>
-    </w:p>
-    <w:p>
-      <w:pPr>
-        <w:contextualSpacing/>
-        <w:rPr>
-          <w:sz w:val="16"/>
-          <w:szCs w:val="16"/>
-        </w:rPr>
-      </w:pPr>
-    </w:p>
-    <w:p>
-      <w:pPr>
-        <w:contextualSpacing/>
-        <w:jc w:val="both"/>
-        <w:rPr>
-          <w:sz w:val="16"/>
-          <w:szCs w:val="16"/>
-        </w:rPr>
-      </w:pPr>
-      <w:r>
-        <w:rPr>
-          <w:noProof/>
-          <w:sz w:val="16"/>
-          <w:szCs w:val="16"/>
-        </w:rPr>
-        <w:drawing>
-          <wp:anchor distT="0" distB="0" distL="114300" distR="114300" simplePos="0" relativeHeight="251766784" behindDoc="1" locked="0" layoutInCell="1" allowOverlap="1" wp14:anchorId="72B580E6" wp14:editId="381EFA28">
-            <wp:simplePos x="0" y="0"/>
-            <wp:positionH relativeFrom="margin">
-              <wp:posOffset>340241</wp:posOffset>
-            </wp:positionH>
-            <wp:positionV relativeFrom="paragraph">
-              <wp:posOffset>48289</wp:posOffset>
-            </wp:positionV>
-            <wp:extent cx="381635" cy="140970"/>
-            <wp:effectExtent l="0" t="0" r="0" b="0"/>
-            <wp:wrapTight wrapText="bothSides">
-              <wp:wrapPolygon edited="0">
-                <wp:start x="0" y="0"/>
-                <wp:lineTo x="0" y="17514"/>
-                <wp:lineTo x="20486" y="17514"/>
-                <wp:lineTo x="20486" y="0"/>
-                <wp:lineTo x="0" y="0"/>
-              </wp:wrapPolygon>
-            </wp:wrapTight>
-            <wp:docPr id="1952859746" name="Imagen 1"/>
-            <wp:cNvGraphicFramePr>
-              <a:graphicFrameLocks xmlns:a="http://schemas.openxmlformats.org/drawingml/2006/main" noChangeAspect="1"/>
-            </wp:cNvGraphicFramePr>
-            <a:graphic xmlns:a="http://schemas.openxmlformats.org/drawingml/2006/main">
-              <a:graphicData uri="http://schemas.openxmlformats.org/drawingml/2006/picture">
-                <pic:pic xmlns:pic="http://schemas.openxmlformats.org/drawingml/2006/picture">
-                  <pic:nvPicPr>
-                    <pic:cNvPr id="1970752238" name=""/>
-                    <pic:cNvPicPr/>
-                  </pic:nvPicPr>
-                  <pic:blipFill>
-                    <a:blip r:embed="rId8" cstate="print">
-                      <a:extLst>
-                        <a:ext uri="{28A0092B-C50C-407E-A947-70E740481C1C}">
-                          <a14:useLocalDpi xmlns:a14="http://schemas.microsoft.com/office/drawing/2010/main" val="0"/>
-                        </a:ext>
-                      </a:extLst>
-                    </a:blip>
-                    <a:stretch>
-                      <a:fillRect/>
-                    </a:stretch>
-                  </pic:blipFill>
-                  <pic:spPr>
-                    <a:xfrm>
-                      <a:off x="0" y="0"/>
-                      <a:ext cx="381635" cy="140970"/>
-                    </a:xfrm>
-                    <a:prstGeom prst="rect">
-                      <a:avLst/>
-                    </a:prstGeom>
-                  </pic:spPr>
-                </pic:pic>
-              </a:graphicData>
-            </a:graphic>
-            <wp14:sizeRelH relativeFrom="margin">
-              <wp14:pctWidth>0</wp14:pctWidth>
-            </wp14:sizeRelH>
-            <wp14:sizeRelV relativeFrom="margin">
-              <wp14:pctHeight>0</wp14:pctHeight>
-            </wp14:sizeRelV>
-          </wp:anchor>
-        </w:drawing>
-      </w:r>
-    </w:p>
-    <w:p>
-      <w:pPr>
-        <w:contextualSpacing/>
-        <w:rPr>
-          <w:sz w:val="16"/>
-          <w:szCs w:val="16"/>
-        </w:rPr>
-      </w:pPr>
-    </w:p>
-    <w:p>
-      <w:pPr>
-        <w:contextualSpacing/>
-        <w:rPr>
-          <w:b/>
-          <w:sz w:val="16"/>
-          <w:szCs w:val="16"/>
-        </w:rPr>
-      </w:pPr>
-      <w:r>
-        <w:rPr>
-          <w:b/>
-          <w:sz w:val="16"/>
-          <w:szCs w:val="16"/>
-        </w:rPr>
-        <w:t>-------------------------------------</w:t>
-      </w:r>
-      <w:r>
-        <w:rPr>
-          <w:b/>
-          <w:sz w:val="16"/>
-          <w:szCs w:val="16"/>
-        </w:rPr>
-        <w:t xml:space="preserve">                                                                                                  </w:t>
-      </w:r>
-      <w:r>
-        <w:rPr>
-          <w:b/>
-          <w:sz w:val="16"/>
-          <w:szCs w:val="16"/>
-        </w:rPr>
-        <w:t xml:space="preserve">  ------------------------------------</w:t>
-      </w:r>
-    </w:p>
-    <w:p>
-      <w:pPr>
-        <w:contextualSpacing/>
-        <w:rPr>
-          <w:b/>
-          <w:sz w:val="16"/>
-          <w:szCs w:val="16"/>
-        </w:rPr>
-      </w:pPr>
-      <w:r>
-        <w:rPr>
-          <w:b/>
-          <w:sz w:val="16"/>
-          <w:szCs w:val="16"/>
-        </w:rPr>
-        <w:t xml:space="preserve">GOBRAVCORP/PRESTADOR      </w:t>
-      </w:r>
-      <w:r>
-        <w:rPr>
-          <w:b/>
-          <w:sz w:val="16"/>
-          <w:szCs w:val="16"/>
-        </w:rPr>
-        <w:t xml:space="preserve">     </w:t>
-      </w:r>
-      <w:r>
-        <w:rPr>
-          <w:b/>
-          <w:sz w:val="16"/>
-          <w:szCs w:val="16"/>
-        </w:rPr>
-        <w:t xml:space="preserve">   </w:t>
-      </w:r>
-      <w:r>
-        <w:rPr>
-          <w:b/>
-          <w:sz w:val="16"/>
-          <w:szCs w:val="16"/>
-        </w:rPr>
-        <w:t xml:space="preserve">                                                                                     </w:t>
-      </w:r>
-      <w:r>
-        <w:rPr>
-          <w:b/>
-          <w:sz w:val="16"/>
-          <w:szCs w:val="16"/>
-        </w:rPr>
-        <w:t xml:space="preserve"> ABONADO/SUBSCRIPTOR</w:t>
-      </w:r>
-    </w:p>
-    <w:p>
-      <w:pPr>
-        <w:tabs>
-          <w:tab w:val="left" w:pos="900"/>
-        </w:tabs>
-        <w:contextualSpacing/>
-        <w:rPr>
-          <w:b/>
-          <w:sz w:val="16"/>
-          <w:szCs w:val="16"/>
-        </w:rPr>
-      </w:pPr>
-      <w:r>
-        <w:rPr>
-          <w:b/>
-          <w:sz w:val="16"/>
-          <w:szCs w:val="16"/>
-        </w:rPr>
-        <w:t>*********************************************************************************************</w:t>
       </w:r>
     </w:p>
     <w:p>
@@ -6652,7 +6153,6 @@
           <w:sz w:val="16"/>
           <w:szCs w:val="16"/>
         </w:rPr>
-        <w:lastRenderedPageBreak/>
         <w:t>Débito automático a la cuenta bancaria del Abonado:      NO</w:t>
       </w:r>
     </w:p>
@@ -7268,95 +6768,6 @@
     <w:p>
       <w:pPr>
         <w:contextualSpacing/>
-        <w:jc w:val="both"/>
-        <w:rPr>
-          <w:sz w:val="16"/>
-          <w:szCs w:val="16"/>
-        </w:rPr>
-      </w:pPr>
-      <w:r>
-        <w:rPr>
-          <w:noProof/>
-          <w:sz w:val="16"/>
-          <w:szCs w:val="16"/>
-        </w:rPr>
-        <w:drawing>
-          <wp:anchor distT="0" distB="0" distL="114300" distR="114300" simplePos="0" relativeHeight="251768832" behindDoc="1" locked="0" layoutInCell="1" allowOverlap="1" wp14:anchorId="5DC6A11F" wp14:editId="28200D7C">
-            <wp:simplePos x="0" y="0"/>
-            <wp:positionH relativeFrom="margin">
-              <wp:posOffset>340241</wp:posOffset>
-            </wp:positionH>
-            <wp:positionV relativeFrom="paragraph">
-              <wp:posOffset>48289</wp:posOffset>
-            </wp:positionV>
-            <wp:extent cx="381635" cy="140970"/>
-            <wp:effectExtent l="0" t="0" r="0" b="0"/>
-            <wp:wrapTight wrapText="bothSides">
-              <wp:wrapPolygon edited="0">
-                <wp:start x="0" y="0"/>
-                <wp:lineTo x="0" y="17514"/>
-                <wp:lineTo x="20486" y="17514"/>
-                <wp:lineTo x="20486" y="0"/>
-                <wp:lineTo x="0" y="0"/>
-              </wp:wrapPolygon>
-            </wp:wrapTight>
-            <wp:docPr id="220131627" name="Imagen 1"/>
-            <wp:cNvGraphicFramePr>
-              <a:graphicFrameLocks xmlns:a="http://schemas.openxmlformats.org/drawingml/2006/main" noChangeAspect="1"/>
-            </wp:cNvGraphicFramePr>
-            <a:graphic xmlns:a="http://schemas.openxmlformats.org/drawingml/2006/main">
-              <a:graphicData uri="http://schemas.openxmlformats.org/drawingml/2006/picture">
-                <pic:pic xmlns:pic="http://schemas.openxmlformats.org/drawingml/2006/picture">
-                  <pic:nvPicPr>
-                    <pic:cNvPr id="1970752238" name=""/>
-                    <pic:cNvPicPr/>
-                  </pic:nvPicPr>
-                  <pic:blipFill>
-                    <a:blip r:embed="rId8" cstate="print">
-                      <a:extLst>
-                        <a:ext uri="{28A0092B-C50C-407E-A947-70E740481C1C}">
-                          <a14:useLocalDpi xmlns:a14="http://schemas.microsoft.com/office/drawing/2010/main" val="0"/>
-                        </a:ext>
-                      </a:extLst>
-                    </a:blip>
-                    <a:stretch>
-                      <a:fillRect/>
-                    </a:stretch>
-                  </pic:blipFill>
-                  <pic:spPr>
-                    <a:xfrm>
-                      <a:off x="0" y="0"/>
-                      <a:ext cx="381635" cy="140970"/>
-                    </a:xfrm>
-                    <a:prstGeom prst="rect">
-                      <a:avLst/>
-                    </a:prstGeom>
-                  </pic:spPr>
-                </pic:pic>
-              </a:graphicData>
-            </a:graphic>
-            <wp14:sizeRelH relativeFrom="margin">
-              <wp14:pctWidth>0</wp14:pctWidth>
-            </wp14:sizeRelH>
-            <wp14:sizeRelV relativeFrom="margin">
-              <wp14:pctHeight>0</wp14:pctHeight>
-            </wp14:sizeRelV>
-          </wp:anchor>
-        </w:drawing>
-      </w:r>
-    </w:p>
-    <w:p>
-      <w:pPr>
-        <w:contextualSpacing/>
-        <w:rPr>
-          <w:sz w:val="16"/>
-          <w:szCs w:val="16"/>
-        </w:rPr>
-      </w:pPr>
-    </w:p>
-    <w:p>
-      <w:pPr>
-        <w:contextualSpacing/>
         <w:rPr>
           <w:b/>
           <w:sz w:val="16"/>
@@ -7440,24 +6851,14 @@
     </w:p>
     <w:p>
       <w:pPr>
-        <w:tabs>
-          <w:tab w:val="left" w:pos="900"/>
-        </w:tabs>
-        <w:contextualSpacing/>
-        <w:rPr>
-          <w:b/>
-          <w:sz w:val="16"/>
-          <w:szCs w:val="16"/>
-        </w:rPr>
-      </w:pPr>
-      <w:r>
-        <w:rPr>
-          <w:b/>
-          <w:sz w:val="16"/>
-          <w:szCs w:val="16"/>
-        </w:rPr>
-        <w:t>*********************************************************************************************</w:t>
-      </w:r>
+        <w:contextualSpacing/>
+        <w:jc w:val="center"/>
+        <w:rPr>
+          <w:b/>
+          <w:sz w:val="16"/>
+          <w:szCs w:val="16"/>
+        </w:rPr>
+      </w:pPr>
     </w:p>
     <w:p>
       <w:pPr>

</xml_diff>